<commit_message>
Add docx_template_path to sysdoc.toml for document template reference
</commit_message>
<xml_diff>
--- a/template.docx
+++ b/template.docx
@@ -1521,7 +1521,6 @@
     <w:lsdException w:name="Strong" w:uiPriority="22" w:qFormat="1"/>
     <w:lsdException w:name="Emphasis" w:uiPriority="20" w:qFormat="1"/>
     <w:lsdException w:name="Document Map" w:semiHidden="1" w:unhideWhenUsed="1"/>
-    <w:lsdException w:name="Plain Text" w:semiHidden="1" w:unhideWhenUsed="1"/>
     <w:lsdException w:name="E-mail Signature" w:semiHidden="1" w:unhideWhenUsed="1"/>
     <w:lsdException w:name="HTML Top of Form" w:semiHidden="1" w:unhideWhenUsed="1"/>
     <w:lsdException w:name="HTML Bottom of Form" w:semiHidden="1" w:unhideWhenUsed="1"/>
@@ -1811,7 +1810,7 @@
   <w:style w:type="paragraph" w:default="1" w:styleId="Normal">
     <w:name w:val="Normal"/>
     <w:qFormat/>
-    <w:rsid w:val="007C63F8"/>
+    <w:rsid w:val="00907E5B"/>
     <w:rPr>
       <w:rFonts w:ascii="Merriweather" w:hAnsi="Merriweather"/>
     </w:rPr>
@@ -1843,8 +1842,6 @@
     <w:next w:val="Normal"/>
     <w:link w:val="Heading2Char"/>
     <w:uiPriority w:val="9"/>
-    <w:semiHidden/>
-    <w:unhideWhenUsed/>
     <w:qFormat/>
     <w:rsid w:val="007C63F8"/>
     <w:pPr>
@@ -1866,8 +1863,6 @@
     <w:next w:val="Normal"/>
     <w:link w:val="Heading3Char"/>
     <w:uiPriority w:val="9"/>
-    <w:semiHidden/>
-    <w:unhideWhenUsed/>
     <w:qFormat/>
     <w:rsid w:val="007C63F8"/>
     <w:pPr>
@@ -1889,8 +1884,6 @@
     <w:next w:val="Normal"/>
     <w:link w:val="Heading4Char"/>
     <w:uiPriority w:val="9"/>
-    <w:semiHidden/>
-    <w:unhideWhenUsed/>
     <w:qFormat/>
     <w:rsid w:val="007C63F8"/>
     <w:pPr>
@@ -1912,8 +1905,6 @@
     <w:next w:val="Normal"/>
     <w:link w:val="Heading5Char"/>
     <w:uiPriority w:val="9"/>
-    <w:semiHidden/>
-    <w:unhideWhenUsed/>
     <w:qFormat/>
     <w:rsid w:val="007C63F8"/>
     <w:pPr>
@@ -1933,8 +1924,6 @@
     <w:next w:val="Normal"/>
     <w:link w:val="Heading6Char"/>
     <w:uiPriority w:val="9"/>
-    <w:semiHidden/>
-    <w:unhideWhenUsed/>
     <w:qFormat/>
     <w:rsid w:val="007C63F8"/>
     <w:pPr>
@@ -1956,8 +1945,6 @@
     <w:next w:val="Normal"/>
     <w:link w:val="Heading7Char"/>
     <w:uiPriority w:val="9"/>
-    <w:semiHidden/>
-    <w:unhideWhenUsed/>
     <w:qFormat/>
     <w:rsid w:val="007C63F8"/>
     <w:pPr>
@@ -1977,8 +1964,6 @@
     <w:next w:val="Normal"/>
     <w:link w:val="Heading8Char"/>
     <w:uiPriority w:val="9"/>
-    <w:semiHidden/>
-    <w:unhideWhenUsed/>
     <w:qFormat/>
     <w:rsid w:val="007C63F8"/>
     <w:pPr>
@@ -2000,8 +1985,6 @@
     <w:next w:val="Normal"/>
     <w:link w:val="Heading9Char"/>
     <w:uiPriority w:val="9"/>
-    <w:semiHidden/>
-    <w:unhideWhenUsed/>
     <w:qFormat/>
     <w:rsid w:val="007C63F8"/>
     <w:pPr>
@@ -2060,8 +2043,7 @@
     <w:basedOn w:val="DefaultParagraphFont"/>
     <w:link w:val="Heading2"/>
     <w:uiPriority w:val="9"/>
-    <w:semiHidden/>
-    <w:rsid w:val="007C63F8"/>
+    <w:rsid w:val="00907E5B"/>
     <w:rPr>
       <w:rFonts w:asciiTheme="majorHAnsi" w:eastAsiaTheme="majorEastAsia" w:hAnsiTheme="majorHAnsi" w:cstheme="majorBidi"/>
       <w:color w:val="0F4761" w:themeColor="accent1" w:themeShade="BF"/>
@@ -2074,10 +2056,9 @@
     <w:basedOn w:val="DefaultParagraphFont"/>
     <w:link w:val="Heading3"/>
     <w:uiPriority w:val="9"/>
-    <w:semiHidden/>
-    <w:rsid w:val="007C63F8"/>
-    <w:rPr>
-      <w:rFonts w:eastAsiaTheme="majorEastAsia" w:cstheme="majorBidi"/>
+    <w:rsid w:val="00907E5B"/>
+    <w:rPr>
+      <w:rFonts w:ascii="Merriweather" w:eastAsiaTheme="majorEastAsia" w:hAnsi="Merriweather" w:cstheme="majorBidi"/>
       <w:color w:val="0F4761" w:themeColor="accent1" w:themeShade="BF"/>
       <w:sz w:val="28"/>
       <w:szCs w:val="28"/>
@@ -2088,10 +2069,9 @@
     <w:basedOn w:val="DefaultParagraphFont"/>
     <w:link w:val="Heading4"/>
     <w:uiPriority w:val="9"/>
-    <w:semiHidden/>
-    <w:rsid w:val="007C63F8"/>
-    <w:rPr>
-      <w:rFonts w:eastAsiaTheme="majorEastAsia" w:cstheme="majorBidi"/>
+    <w:rsid w:val="00907E5B"/>
+    <w:rPr>
+      <w:rFonts w:ascii="Merriweather" w:eastAsiaTheme="majorEastAsia" w:hAnsi="Merriweather" w:cstheme="majorBidi"/>
       <w:i/>
       <w:iCs/>
       <w:color w:val="0F4761" w:themeColor="accent1" w:themeShade="BF"/>
@@ -2102,10 +2082,9 @@
     <w:basedOn w:val="DefaultParagraphFont"/>
     <w:link w:val="Heading5"/>
     <w:uiPriority w:val="9"/>
-    <w:semiHidden/>
-    <w:rsid w:val="007C63F8"/>
-    <w:rPr>
-      <w:rFonts w:eastAsiaTheme="majorEastAsia" w:cstheme="majorBidi"/>
+    <w:rsid w:val="00907E5B"/>
+    <w:rPr>
+      <w:rFonts w:ascii="Merriweather" w:eastAsiaTheme="majorEastAsia" w:hAnsi="Merriweather" w:cstheme="majorBidi"/>
       <w:color w:val="0F4761" w:themeColor="accent1" w:themeShade="BF"/>
     </w:rPr>
   </w:style>
@@ -2114,10 +2093,9 @@
     <w:basedOn w:val="DefaultParagraphFont"/>
     <w:link w:val="Heading6"/>
     <w:uiPriority w:val="9"/>
-    <w:semiHidden/>
-    <w:rsid w:val="007C63F8"/>
-    <w:rPr>
-      <w:rFonts w:eastAsiaTheme="majorEastAsia" w:cstheme="majorBidi"/>
+    <w:rsid w:val="00907E5B"/>
+    <w:rPr>
+      <w:rFonts w:ascii="Merriweather" w:eastAsiaTheme="majorEastAsia" w:hAnsi="Merriweather" w:cstheme="majorBidi"/>
       <w:i/>
       <w:iCs/>
       <w:color w:val="595959" w:themeColor="text1" w:themeTint="A6"/>
@@ -2128,10 +2106,9 @@
     <w:basedOn w:val="DefaultParagraphFont"/>
     <w:link w:val="Heading7"/>
     <w:uiPriority w:val="9"/>
-    <w:semiHidden/>
-    <w:rsid w:val="007C63F8"/>
-    <w:rPr>
-      <w:rFonts w:eastAsiaTheme="majorEastAsia" w:cstheme="majorBidi"/>
+    <w:rsid w:val="00907E5B"/>
+    <w:rPr>
+      <w:rFonts w:ascii="Merriweather" w:eastAsiaTheme="majorEastAsia" w:hAnsi="Merriweather" w:cstheme="majorBidi"/>
       <w:color w:val="595959" w:themeColor="text1" w:themeTint="A6"/>
     </w:rPr>
   </w:style>
@@ -2140,10 +2117,9 @@
     <w:basedOn w:val="DefaultParagraphFont"/>
     <w:link w:val="Heading8"/>
     <w:uiPriority w:val="9"/>
-    <w:semiHidden/>
-    <w:rsid w:val="007C63F8"/>
-    <w:rPr>
-      <w:rFonts w:eastAsiaTheme="majorEastAsia" w:cstheme="majorBidi"/>
+    <w:rsid w:val="00907E5B"/>
+    <w:rPr>
+      <w:rFonts w:ascii="Merriweather" w:eastAsiaTheme="majorEastAsia" w:hAnsi="Merriweather" w:cstheme="majorBidi"/>
       <w:i/>
       <w:iCs/>
       <w:color w:val="272727" w:themeColor="text1" w:themeTint="D8"/>
@@ -2154,10 +2130,9 @@
     <w:basedOn w:val="DefaultParagraphFont"/>
     <w:link w:val="Heading9"/>
     <w:uiPriority w:val="9"/>
-    <w:semiHidden/>
-    <w:rsid w:val="007C63F8"/>
-    <w:rPr>
-      <w:rFonts w:eastAsiaTheme="majorEastAsia" w:cstheme="majorBidi"/>
+    <w:rsid w:val="00907E5B"/>
+    <w:rPr>
+      <w:rFonts w:ascii="Merriweather" w:eastAsiaTheme="majorEastAsia" w:hAnsi="Merriweather" w:cstheme="majorBidi"/>
       <w:color w:val="272727" w:themeColor="text1" w:themeTint="D8"/>
     </w:rPr>
   </w:style>
@@ -2558,9 +2533,11 @@
     <w:rsidRoot w:val="00A4082C"/>
     <w:rsid w:val="0007599B"/>
     <w:rsid w:val="00376DD3"/>
+    <w:rsid w:val="00526958"/>
     <w:rsid w:val="008B444B"/>
     <w:rsid w:val="00A4082C"/>
     <w:rsid w:val="00DF53CF"/>
+    <w:rsid w:val="00EF1DE5"/>
     <w:rsid w:val="00FF3228"/>
   </w:rsids>
   <m:mathPr>

</xml_diff>

<commit_message>
Refactor .gitignore entries, update system overview image, and enhance sysdoc.toml with document title and owner details
</commit_message>
<xml_diff>
--- a/template.docx
+++ b/template.docx
@@ -1441,102 +1441,26 @@
     <w:lsdException w:name="heading 7" w:semiHidden="1" w:uiPriority="9" w:unhideWhenUsed="1" w:qFormat="1"/>
     <w:lsdException w:name="heading 8" w:semiHidden="1" w:uiPriority="9" w:unhideWhenUsed="1" w:qFormat="1"/>
     <w:lsdException w:name="heading 9" w:semiHidden="1" w:uiPriority="9" w:unhideWhenUsed="1" w:qFormat="1"/>
-    <w:lsdException w:name="index 1" w:semiHidden="1" w:unhideWhenUsed="1"/>
-    <w:lsdException w:name="index 2" w:semiHidden="1" w:unhideWhenUsed="1"/>
-    <w:lsdException w:name="index 3" w:semiHidden="1" w:unhideWhenUsed="1"/>
-    <w:lsdException w:name="index 4" w:semiHidden="1" w:unhideWhenUsed="1"/>
-    <w:lsdException w:name="index 5" w:semiHidden="1" w:unhideWhenUsed="1"/>
-    <w:lsdException w:name="index 6" w:semiHidden="1" w:unhideWhenUsed="1"/>
-    <w:lsdException w:name="index 7" w:semiHidden="1" w:unhideWhenUsed="1"/>
-    <w:lsdException w:name="index 8" w:semiHidden="1" w:unhideWhenUsed="1"/>
-    <w:lsdException w:name="index 9" w:semiHidden="1" w:unhideWhenUsed="1"/>
-    <w:lsdException w:name="toc 1" w:semiHidden="1" w:uiPriority="39" w:unhideWhenUsed="1"/>
-    <w:lsdException w:name="toc 2" w:semiHidden="1" w:uiPriority="39" w:unhideWhenUsed="1"/>
-    <w:lsdException w:name="toc 3" w:semiHidden="1" w:uiPriority="39" w:unhideWhenUsed="1"/>
-    <w:lsdException w:name="toc 4" w:semiHidden="1" w:uiPriority="39" w:unhideWhenUsed="1"/>
-    <w:lsdException w:name="toc 5" w:semiHidden="1" w:uiPriority="39" w:unhideWhenUsed="1"/>
-    <w:lsdException w:name="toc 6" w:semiHidden="1" w:uiPriority="39" w:unhideWhenUsed="1"/>
-    <w:lsdException w:name="toc 7" w:semiHidden="1" w:uiPriority="39" w:unhideWhenUsed="1"/>
-    <w:lsdException w:name="toc 8" w:semiHidden="1" w:uiPriority="39" w:unhideWhenUsed="1"/>
-    <w:lsdException w:name="toc 9" w:semiHidden="1" w:uiPriority="39" w:unhideWhenUsed="1"/>
-    <w:lsdException w:name="Normal Indent" w:semiHidden="1" w:unhideWhenUsed="1"/>
-    <w:lsdException w:name="footnote text" w:semiHidden="1" w:unhideWhenUsed="1"/>
-    <w:lsdException w:name="annotation text" w:semiHidden="1" w:unhideWhenUsed="1"/>
+    <w:lsdException w:name="toc 1" w:uiPriority="39"/>
+    <w:lsdException w:name="toc 2" w:uiPriority="39"/>
+    <w:lsdException w:name="toc 3" w:uiPriority="39"/>
+    <w:lsdException w:name="toc 4" w:uiPriority="39"/>
+    <w:lsdException w:name="toc 5" w:uiPriority="39"/>
+    <w:lsdException w:name="toc 6" w:uiPriority="39"/>
+    <w:lsdException w:name="toc 7" w:uiPriority="39"/>
+    <w:lsdException w:name="toc 8" w:uiPriority="39"/>
+    <w:lsdException w:name="toc 9" w:uiPriority="39"/>
     <w:lsdException w:name="header" w:semiHidden="1" w:unhideWhenUsed="1"/>
     <w:lsdException w:name="footer" w:semiHidden="1" w:unhideWhenUsed="1"/>
-    <w:lsdException w:name="index heading" w:semiHidden="1" w:unhideWhenUsed="1"/>
-    <w:lsdException w:name="caption" w:semiHidden="1" w:uiPriority="35" w:unhideWhenUsed="1" w:qFormat="1"/>
-    <w:lsdException w:name="table of figures" w:semiHidden="1" w:unhideWhenUsed="1"/>
-    <w:lsdException w:name="envelope address" w:semiHidden="1" w:unhideWhenUsed="1"/>
-    <w:lsdException w:name="envelope return" w:semiHidden="1" w:unhideWhenUsed="1"/>
-    <w:lsdException w:name="footnote reference" w:semiHidden="1" w:unhideWhenUsed="1"/>
-    <w:lsdException w:name="annotation reference" w:semiHidden="1" w:unhideWhenUsed="1"/>
-    <w:lsdException w:name="line number" w:semiHidden="1" w:unhideWhenUsed="1"/>
-    <w:lsdException w:name="page number" w:semiHidden="1" w:unhideWhenUsed="1"/>
-    <w:lsdException w:name="endnote reference" w:semiHidden="1" w:unhideWhenUsed="1"/>
-    <w:lsdException w:name="endnote text" w:semiHidden="1" w:unhideWhenUsed="1"/>
-    <w:lsdException w:name="table of authorities" w:semiHidden="1" w:unhideWhenUsed="1"/>
-    <w:lsdException w:name="macro" w:semiHidden="1" w:unhideWhenUsed="1"/>
-    <w:lsdException w:name="toa heading" w:semiHidden="1" w:unhideWhenUsed="1"/>
-    <w:lsdException w:name="List" w:semiHidden="1" w:unhideWhenUsed="1"/>
-    <w:lsdException w:name="List Bullet" w:semiHidden="1" w:unhideWhenUsed="1"/>
-    <w:lsdException w:name="List Number" w:semiHidden="1" w:unhideWhenUsed="1"/>
-    <w:lsdException w:name="List 2" w:semiHidden="1" w:unhideWhenUsed="1"/>
-    <w:lsdException w:name="List 3" w:semiHidden="1" w:unhideWhenUsed="1"/>
-    <w:lsdException w:name="List 4" w:semiHidden="1" w:unhideWhenUsed="1"/>
-    <w:lsdException w:name="List 5" w:semiHidden="1" w:unhideWhenUsed="1"/>
-    <w:lsdException w:name="List Bullet 2" w:semiHidden="1" w:unhideWhenUsed="1"/>
-    <w:lsdException w:name="List Bullet 3" w:semiHidden="1" w:unhideWhenUsed="1"/>
-    <w:lsdException w:name="List Bullet 4" w:semiHidden="1" w:unhideWhenUsed="1"/>
-    <w:lsdException w:name="List Bullet 5" w:semiHidden="1" w:unhideWhenUsed="1"/>
-    <w:lsdException w:name="List Number 2" w:semiHidden="1" w:unhideWhenUsed="1"/>
-    <w:lsdException w:name="List Number 3" w:semiHidden="1" w:unhideWhenUsed="1"/>
-    <w:lsdException w:name="List Number 4" w:semiHidden="1" w:unhideWhenUsed="1"/>
-    <w:lsdException w:name="List Number 5" w:semiHidden="1" w:unhideWhenUsed="1"/>
+    <w:lsdException w:name="caption" w:uiPriority="35" w:qFormat="1"/>
     <w:lsdException w:name="Title" w:uiPriority="10" w:qFormat="1"/>
-    <w:lsdException w:name="Closing" w:semiHidden="1" w:unhideWhenUsed="1"/>
-    <w:lsdException w:name="Signature" w:semiHidden="1" w:unhideWhenUsed="1"/>
     <w:lsdException w:name="Default Paragraph Font" w:semiHidden="1" w:uiPriority="1" w:unhideWhenUsed="1"/>
-    <w:lsdException w:name="Body Text" w:semiHidden="1" w:unhideWhenUsed="1"/>
-    <w:lsdException w:name="Body Text Indent" w:semiHidden="1" w:unhideWhenUsed="1"/>
-    <w:lsdException w:name="List Continue" w:semiHidden="1" w:unhideWhenUsed="1"/>
-    <w:lsdException w:name="List Continue 2" w:semiHidden="1" w:unhideWhenUsed="1"/>
-    <w:lsdException w:name="List Continue 3" w:semiHidden="1" w:unhideWhenUsed="1"/>
-    <w:lsdException w:name="List Continue 4" w:semiHidden="1" w:unhideWhenUsed="1"/>
-    <w:lsdException w:name="List Continue 5" w:semiHidden="1" w:unhideWhenUsed="1"/>
-    <w:lsdException w:name="Message Header" w:semiHidden="1" w:unhideWhenUsed="1"/>
     <w:lsdException w:name="Subtitle" w:uiPriority="11" w:qFormat="1"/>
-    <w:lsdException w:name="Salutation" w:semiHidden="1" w:unhideWhenUsed="1"/>
-    <w:lsdException w:name="Date" w:semiHidden="1" w:unhideWhenUsed="1"/>
-    <w:lsdException w:name="Body Text First Indent" w:semiHidden="1" w:unhideWhenUsed="1"/>
-    <w:lsdException w:name="Body Text First Indent 2" w:semiHidden="1" w:unhideWhenUsed="1"/>
-    <w:lsdException w:name="Note Heading" w:semiHidden="1" w:unhideWhenUsed="1"/>
-    <w:lsdException w:name="Body Text 2" w:semiHidden="1" w:unhideWhenUsed="1"/>
-    <w:lsdException w:name="Body Text 3" w:semiHidden="1" w:unhideWhenUsed="1"/>
-    <w:lsdException w:name="Body Text Indent 2" w:semiHidden="1" w:unhideWhenUsed="1"/>
-    <w:lsdException w:name="Body Text Indent 3" w:semiHidden="1" w:unhideWhenUsed="1"/>
-    <w:lsdException w:name="Block Text" w:semiHidden="1" w:unhideWhenUsed="1"/>
-    <w:lsdException w:name="Hyperlink" w:semiHidden="1" w:unhideWhenUsed="1"/>
-    <w:lsdException w:name="FollowedHyperlink" w:semiHidden="1" w:unhideWhenUsed="1"/>
     <w:lsdException w:name="Strong" w:uiPriority="22" w:qFormat="1"/>
     <w:lsdException w:name="Emphasis" w:uiPriority="20" w:qFormat="1"/>
-    <w:lsdException w:name="Document Map" w:semiHidden="1" w:unhideWhenUsed="1"/>
-    <w:lsdException w:name="E-mail Signature" w:semiHidden="1" w:unhideWhenUsed="1"/>
     <w:lsdException w:name="HTML Top of Form" w:semiHidden="1" w:unhideWhenUsed="1"/>
     <w:lsdException w:name="HTML Bottom of Form" w:semiHidden="1" w:unhideWhenUsed="1"/>
-    <w:lsdException w:name="Normal (Web)" w:semiHidden="1" w:unhideWhenUsed="1"/>
-    <w:lsdException w:name="HTML Acronym" w:semiHidden="1" w:unhideWhenUsed="1"/>
-    <w:lsdException w:name="HTML Address" w:semiHidden="1" w:unhideWhenUsed="1"/>
-    <w:lsdException w:name="HTML Cite" w:semiHidden="1" w:unhideWhenUsed="1"/>
-    <w:lsdException w:name="HTML Code" w:semiHidden="1" w:unhideWhenUsed="1"/>
-    <w:lsdException w:name="HTML Definition" w:semiHidden="1" w:unhideWhenUsed="1"/>
-    <w:lsdException w:name="HTML Keyboard" w:semiHidden="1" w:unhideWhenUsed="1"/>
-    <w:lsdException w:name="HTML Preformatted" w:semiHidden="1" w:unhideWhenUsed="1"/>
-    <w:lsdException w:name="HTML Sample" w:semiHidden="1" w:unhideWhenUsed="1"/>
-    <w:lsdException w:name="HTML Typewriter" w:semiHidden="1" w:unhideWhenUsed="1"/>
-    <w:lsdException w:name="HTML Variable" w:semiHidden="1" w:unhideWhenUsed="1"/>
     <w:lsdException w:name="Normal Table" w:semiHidden="1" w:unhideWhenUsed="1"/>
-    <w:lsdException w:name="annotation subject" w:semiHidden="1" w:unhideWhenUsed="1"/>
     <w:lsdException w:name="No List" w:semiHidden="1" w:unhideWhenUsed="1"/>
     <w:lsdException w:name="Outline List 1" w:semiHidden="1" w:unhideWhenUsed="1"/>
     <w:lsdException w:name="Outline List 2" w:semiHidden="1" w:unhideWhenUsed="1"/>
@@ -1583,7 +1507,6 @@
     <w:lsdException w:name="Table Web 1" w:semiHidden="1" w:unhideWhenUsed="1"/>
     <w:lsdException w:name="Table Web 2" w:semiHidden="1" w:unhideWhenUsed="1"/>
     <w:lsdException w:name="Table Web 3" w:semiHidden="1" w:unhideWhenUsed="1"/>
-    <w:lsdException w:name="Balloon Text" w:semiHidden="1" w:unhideWhenUsed="1"/>
     <w:lsdException w:name="Table Grid" w:uiPriority="39"/>
     <w:lsdException w:name="Table Theme" w:semiHidden="1" w:unhideWhenUsed="1"/>
     <w:lsdException w:name="Placeholder Text" w:semiHidden="1"/>
@@ -1695,7 +1618,7 @@
     <w:lsdException w:name="Subtle Reference" w:uiPriority="31" w:qFormat="1"/>
     <w:lsdException w:name="Intense Reference" w:uiPriority="32" w:qFormat="1"/>
     <w:lsdException w:name="Book Title" w:uiPriority="33" w:qFormat="1"/>
-    <w:lsdException w:name="Bibliography" w:semiHidden="1" w:uiPriority="37" w:unhideWhenUsed="1"/>
+    <w:lsdException w:name="Bibliography" w:uiPriority="37"/>
     <w:lsdException w:name="TOC Heading" w:semiHidden="1" w:uiPriority="39" w:unhideWhenUsed="1" w:qFormat="1"/>
     <w:lsdException w:name="Plain Table 1" w:uiPriority="41"/>
     <w:lsdException w:name="Plain Table 2" w:uiPriority="42"/>
@@ -1801,16 +1724,11 @@
     <w:lsdException w:name="List Table 5 Dark Accent 6" w:uiPriority="50"/>
     <w:lsdException w:name="List Table 6 Colorful Accent 6" w:uiPriority="51"/>
     <w:lsdException w:name="List Table 7 Colorful Accent 6" w:uiPriority="52"/>
-    <w:lsdException w:name="Mention" w:semiHidden="1" w:unhideWhenUsed="1"/>
-    <w:lsdException w:name="Smart Hyperlink" w:semiHidden="1" w:unhideWhenUsed="1"/>
-    <w:lsdException w:name="Hashtag" w:semiHidden="1" w:unhideWhenUsed="1"/>
-    <w:lsdException w:name="Unresolved Mention" w:semiHidden="1" w:unhideWhenUsed="1"/>
-    <w:lsdException w:name="Smart Link" w:semiHidden="1" w:unhideWhenUsed="1"/>
   </w:latentStyles>
   <w:style w:type="paragraph" w:default="1" w:styleId="Normal">
     <w:name w:val="Normal"/>
     <w:qFormat/>
-    <w:rsid w:val="00907E5B"/>
+    <w:rsid w:val="002439A5"/>
     <w:rPr>
       <w:rFonts w:ascii="Merriweather" w:hAnsi="Merriweather"/>
     </w:rPr>
@@ -2030,7 +1948,7 @@
     <w:basedOn w:val="DefaultParagraphFont"/>
     <w:link w:val="Heading1"/>
     <w:uiPriority w:val="9"/>
-    <w:rsid w:val="007C63F8"/>
+    <w:rsid w:val="002439A5"/>
     <w:rPr>
       <w:rFonts w:asciiTheme="majorHAnsi" w:eastAsiaTheme="majorEastAsia" w:hAnsiTheme="majorHAnsi" w:cstheme="majorBidi"/>
       <w:color w:val="0F4761" w:themeColor="accent1" w:themeShade="BF"/>
@@ -2043,7 +1961,7 @@
     <w:basedOn w:val="DefaultParagraphFont"/>
     <w:link w:val="Heading2"/>
     <w:uiPriority w:val="9"/>
-    <w:rsid w:val="00907E5B"/>
+    <w:rsid w:val="002439A5"/>
     <w:rPr>
       <w:rFonts w:asciiTheme="majorHAnsi" w:eastAsiaTheme="majorEastAsia" w:hAnsiTheme="majorHAnsi" w:cstheme="majorBidi"/>
       <w:color w:val="0F4761" w:themeColor="accent1" w:themeShade="BF"/>
@@ -2056,7 +1974,7 @@
     <w:basedOn w:val="DefaultParagraphFont"/>
     <w:link w:val="Heading3"/>
     <w:uiPriority w:val="9"/>
-    <w:rsid w:val="00907E5B"/>
+    <w:rsid w:val="002439A5"/>
     <w:rPr>
       <w:rFonts w:ascii="Merriweather" w:eastAsiaTheme="majorEastAsia" w:hAnsi="Merriweather" w:cstheme="majorBidi"/>
       <w:color w:val="0F4761" w:themeColor="accent1" w:themeShade="BF"/>
@@ -2069,7 +1987,7 @@
     <w:basedOn w:val="DefaultParagraphFont"/>
     <w:link w:val="Heading4"/>
     <w:uiPriority w:val="9"/>
-    <w:rsid w:val="00907E5B"/>
+    <w:rsid w:val="002439A5"/>
     <w:rPr>
       <w:rFonts w:ascii="Merriweather" w:eastAsiaTheme="majorEastAsia" w:hAnsi="Merriweather" w:cstheme="majorBidi"/>
       <w:i/>
@@ -2082,7 +2000,7 @@
     <w:basedOn w:val="DefaultParagraphFont"/>
     <w:link w:val="Heading5"/>
     <w:uiPriority w:val="9"/>
-    <w:rsid w:val="00907E5B"/>
+    <w:rsid w:val="002439A5"/>
     <w:rPr>
       <w:rFonts w:ascii="Merriweather" w:eastAsiaTheme="majorEastAsia" w:hAnsi="Merriweather" w:cstheme="majorBidi"/>
       <w:color w:val="0F4761" w:themeColor="accent1" w:themeShade="BF"/>
@@ -2093,7 +2011,7 @@
     <w:basedOn w:val="DefaultParagraphFont"/>
     <w:link w:val="Heading6"/>
     <w:uiPriority w:val="9"/>
-    <w:rsid w:val="00907E5B"/>
+    <w:rsid w:val="002439A5"/>
     <w:rPr>
       <w:rFonts w:ascii="Merriweather" w:eastAsiaTheme="majorEastAsia" w:hAnsi="Merriweather" w:cstheme="majorBidi"/>
       <w:i/>
@@ -2106,7 +2024,7 @@
     <w:basedOn w:val="DefaultParagraphFont"/>
     <w:link w:val="Heading7"/>
     <w:uiPriority w:val="9"/>
-    <w:rsid w:val="00907E5B"/>
+    <w:rsid w:val="002439A5"/>
     <w:rPr>
       <w:rFonts w:ascii="Merriweather" w:eastAsiaTheme="majorEastAsia" w:hAnsi="Merriweather" w:cstheme="majorBidi"/>
       <w:color w:val="595959" w:themeColor="text1" w:themeTint="A6"/>
@@ -2117,7 +2035,7 @@
     <w:basedOn w:val="DefaultParagraphFont"/>
     <w:link w:val="Heading8"/>
     <w:uiPriority w:val="9"/>
-    <w:rsid w:val="00907E5B"/>
+    <w:rsid w:val="002439A5"/>
     <w:rPr>
       <w:rFonts w:ascii="Merriweather" w:eastAsiaTheme="majorEastAsia" w:hAnsi="Merriweather" w:cstheme="majorBidi"/>
       <w:i/>
@@ -2130,7 +2048,7 @@
     <w:basedOn w:val="DefaultParagraphFont"/>
     <w:link w:val="Heading9"/>
     <w:uiPriority w:val="9"/>
-    <w:rsid w:val="00907E5B"/>
+    <w:rsid w:val="002439A5"/>
     <w:rPr>
       <w:rFonts w:ascii="Merriweather" w:eastAsiaTheme="majorEastAsia" w:hAnsi="Merriweather" w:cstheme="majorBidi"/>
       <w:color w:val="272727" w:themeColor="text1" w:themeTint="D8"/>
@@ -2161,7 +2079,7 @@
     <w:basedOn w:val="DefaultParagraphFont"/>
     <w:link w:val="Title"/>
     <w:uiPriority w:val="10"/>
-    <w:rsid w:val="007C63F8"/>
+    <w:rsid w:val="002439A5"/>
     <w:rPr>
       <w:rFonts w:asciiTheme="majorHAnsi" w:eastAsiaTheme="majorEastAsia" w:hAnsiTheme="majorHAnsi" w:cstheme="majorBidi"/>
       <w:spacing w:val="-10"/>
@@ -2196,9 +2114,9 @@
     <w:basedOn w:val="DefaultParagraphFont"/>
     <w:link w:val="Subtitle"/>
     <w:uiPriority w:val="11"/>
-    <w:rsid w:val="007C63F8"/>
-    <w:rPr>
-      <w:rFonts w:eastAsiaTheme="majorEastAsia" w:cstheme="majorBidi"/>
+    <w:rsid w:val="002439A5"/>
+    <w:rPr>
+      <w:rFonts w:ascii="Merriweather" w:eastAsiaTheme="majorEastAsia" w:hAnsi="Merriweather" w:cstheme="majorBidi"/>
       <w:color w:val="595959" w:themeColor="text1" w:themeTint="A6"/>
       <w:spacing w:val="15"/>
       <w:sz w:val="28"/>
@@ -2228,8 +2146,9 @@
     <w:basedOn w:val="DefaultParagraphFont"/>
     <w:link w:val="Quote"/>
     <w:uiPriority w:val="29"/>
-    <w:rsid w:val="007C63F8"/>
-    <w:rPr>
+    <w:rsid w:val="002439A5"/>
+    <w:rPr>
+      <w:rFonts w:ascii="Merriweather" w:hAnsi="Merriweather"/>
       <w:i/>
       <w:iCs/>
       <w:color w:val="404040" w:themeColor="text1" w:themeTint="BF"/>
@@ -2286,8 +2205,9 @@
     <w:basedOn w:val="DefaultParagraphFont"/>
     <w:link w:val="IntenseQuote"/>
     <w:uiPriority w:val="30"/>
-    <w:rsid w:val="007C63F8"/>
-    <w:rPr>
+    <w:rsid w:val="002439A5"/>
+    <w:rPr>
+      <w:rFonts w:ascii="Merriweather" w:hAnsi="Merriweather"/>
       <w:i/>
       <w:iCs/>
       <w:color w:val="0F4761" w:themeColor="accent1" w:themeShade="BF"/>
@@ -2311,8 +2231,36 @@
     <w:name w:val="header"/>
     <w:basedOn w:val="Normal"/>
     <w:link w:val="HeaderChar"/>
+    <w:autoRedefine/>
     <w:uiPriority w:val="99"/>
-    <w:unhideWhenUsed/>
+    <w:rsid w:val="00C215EA"/>
+    <w:pPr>
+      <w:tabs>
+        <w:tab w:val="center" w:pos="4513"/>
+        <w:tab w:val="right" w:pos="9026"/>
+      </w:tabs>
+      <w:spacing w:after="0" w:line="240" w:lineRule="auto"/>
+    </w:pPr>
+    <w:rPr>
+      <w:sz w:val="20"/>
+    </w:rPr>
+  </w:style>
+  <w:style w:type="character" w:customStyle="1" w:styleId="HeaderChar">
+    <w:name w:val="Header Char"/>
+    <w:basedOn w:val="DefaultParagraphFont"/>
+    <w:link w:val="Header"/>
+    <w:uiPriority w:val="99"/>
+    <w:rsid w:val="00C215EA"/>
+    <w:rPr>
+      <w:rFonts w:ascii="Merriweather" w:hAnsi="Merriweather"/>
+      <w:sz w:val="20"/>
+    </w:rPr>
+  </w:style>
+  <w:style w:type="paragraph" w:styleId="Footer">
+    <w:name w:val="footer"/>
+    <w:basedOn w:val="Normal"/>
+    <w:link w:val="FooterChar"/>
+    <w:uiPriority w:val="99"/>
     <w:rsid w:val="007C63F8"/>
     <w:pPr>
       <w:tabs>
@@ -2322,37 +2270,12 @@
       <w:spacing w:after="0" w:line="240" w:lineRule="auto"/>
     </w:pPr>
   </w:style>
-  <w:style w:type="character" w:customStyle="1" w:styleId="HeaderChar">
-    <w:name w:val="Header Char"/>
-    <w:basedOn w:val="DefaultParagraphFont"/>
-    <w:link w:val="Header"/>
-    <w:uiPriority w:val="99"/>
-    <w:rsid w:val="007C63F8"/>
-    <w:rPr>
-      <w:rFonts w:ascii="Merriweather" w:hAnsi="Merriweather"/>
-    </w:rPr>
-  </w:style>
-  <w:style w:type="paragraph" w:styleId="Footer">
-    <w:name w:val="footer"/>
-    <w:basedOn w:val="Normal"/>
-    <w:link w:val="FooterChar"/>
-    <w:uiPriority w:val="99"/>
-    <w:unhideWhenUsed/>
-    <w:rsid w:val="007C63F8"/>
-    <w:pPr>
-      <w:tabs>
-        <w:tab w:val="center" w:pos="4513"/>
-        <w:tab w:val="right" w:pos="9026"/>
-      </w:tabs>
-      <w:spacing w:after="0" w:line="240" w:lineRule="auto"/>
-    </w:pPr>
-  </w:style>
   <w:style w:type="character" w:customStyle="1" w:styleId="FooterChar">
     <w:name w:val="Footer Char"/>
     <w:basedOn w:val="DefaultParagraphFont"/>
     <w:link w:val="Footer"/>
     <w:uiPriority w:val="99"/>
-    <w:rsid w:val="007C63F8"/>
+    <w:rsid w:val="002439A5"/>
     <w:rPr>
       <w:rFonts w:ascii="Merriweather" w:hAnsi="Merriweather"/>
     </w:rPr>
@@ -2380,7 +2303,7 @@
     <w:basedOn w:val="DefaultParagraphFont"/>
     <w:link w:val="NoSpacing"/>
     <w:uiPriority w:val="1"/>
-    <w:rsid w:val="007C63F8"/>
+    <w:rsid w:val="002439A5"/>
     <w:rPr>
       <w:rFonts w:eastAsiaTheme="minorEastAsia"/>
       <w:kern w:val="0"/>
@@ -2394,7 +2317,6 @@
     <w:name w:val="Placeholder Text"/>
     <w:basedOn w:val="DefaultParagraphFont"/>
     <w:uiPriority w:val="99"/>
-    <w:semiHidden/>
     <w:rsid w:val="00885BD5"/>
     <w:rPr>
       <w:color w:val="666666"/>
@@ -2405,7 +2327,6 @@
     <w:basedOn w:val="Heading1"/>
     <w:next w:val="Normal"/>
     <w:uiPriority w:val="39"/>
-    <w:unhideWhenUsed/>
     <w:qFormat/>
     <w:rsid w:val="00061448"/>
     <w:pPr>
@@ -2532,10 +2453,14 @@
   <w:rsids>
     <w:rsidRoot w:val="00A4082C"/>
     <w:rsid w:val="0007599B"/>
+    <w:rsid w:val="00216A35"/>
+    <w:rsid w:val="00247D03"/>
     <w:rsid w:val="00376DD3"/>
     <w:rsid w:val="00526958"/>
     <w:rsid w:val="008B444B"/>
+    <w:rsid w:val="009B7502"/>
     <w:rsid w:val="00A4082C"/>
+    <w:rsid w:val="00D00701"/>
     <w:rsid w:val="00DF53CF"/>
     <w:rsid w:val="00EF1DE5"/>
     <w:rsid w:val="00FF3228"/>

</xml_diff>